<commit_message>
Taller 1 administrativo al viernes 23 de octubre, 8:00, en paralelo con el comercial
Cronograma, sesiones y citaciones con la fecha nueva; vista por semanas
corregida para los talleres 1 y el T2 comercial; brief de José, ajustes y
propuesta con las fechas del 19 de octubre.

Co-Authored-By: Claude Fable 5.1 <noreply@anthropic.com>
Claude-Session: https://claude.ai/code/session_01Ja1vbRoiAwxTq3mLFGrVau
</commit_message>
<xml_diff>
--- a/docentes/administrativo/Ajustes a los talleres · diagnóstico y política de IA.docx
+++ b/docentes/administrativo/Ajustes a los talleres · diagnóstico y política de IA.docx
@@ -82,7 +82,7 @@
           <w:sz w:val="21"/>
           <w:szCs w:val="21"/>
         </w:rPr>
-        <w:t xml:space="preserve">Pivot Power · documento de trabajo para la dirección del programa y los dos docentes · 15 de octubre de 2026 · fechas según el cronograma ajustado del 15 de octubre</w:t>
+        <w:t xml:space="preserve">Pivot Power · documento de trabajo para la dirección del programa y los dos docentes · 19 de octubre de 2026 · fechas según el cronograma ajustado del 19 de octubre</w:t>
       </w:r>
     </w:p>
     <w:p>
@@ -193,7 +193,7 @@
                 <w:sz w:val="20"/>
                 <w:szCs w:val="20"/>
               </w:rPr>
-              <w:t xml:space="preserve">Con las fechas corridas, el Taller 1 administrativo arranca el miércoles 21 de octubre y el comercial el viernes 23. Los ajustes del Taller 1 entran completos en los dos encuentros, en el kit del participante y en los retos.</w:t>
+              <w:t xml:space="preserve">Con las fechas corridas, los dos talleres 1 arrancan el viernes 23 de octubre: el comercial a las 7:30 y el administrativo a las 8:00. Los ajustes del Taller 1 entran completos en los dos encuentros, en el kit del participante y en los retos.</w:t>
             </w:r>
           </w:p>
         </w:tc>
@@ -5573,7 +5573,7 @@
           <w:sz w:val="21"/>
           <w:szCs w:val="21"/>
         </w:rPr>
-        <w:t xml:space="preserve">Encuentro 1 el miércoles 21 de octubre, consultorio el viernes 23, encuentro 2 el miércoles 28. Los ajustes entran en los dos encuentros, en el kit y en la evaluación.</w:t>
+        <w:t xml:space="preserve">Encuentro 1 el viernes 23 de octubre, consultorio el martes 27, encuentro 2 el miércoles 28. Los ajustes entran en los dos encuentros, en el kit y en la evaluación.</w:t>
       </w:r>
     </w:p>
     <w:tbl>
@@ -9453,7 +9453,7 @@
                 <w:sz w:val="19"/>
                 <w:szCs w:val="19"/>
               </w:rPr>
-              <w:t xml:space="preserve">21 de octubre, encuentro 1 administrativo</w:t>
+              <w:t xml:space="preserve">23 de octubre, encuentro 1 de los dos perfiles</w:t>
             </w:r>
           </w:p>
         </w:tc>
@@ -10256,7 +10256,7 @@
                 <w:sz w:val="19"/>
                 <w:szCs w:val="19"/>
               </w:rPr>
-              <w:t xml:space="preserve">Fechas del T1: 23 y 30 de octubre comercial, 21 y 28 administrativo. T2 comercial: 13 y 20 de noviembre. T1 de los dos perfiles: demostración con el archivo del kit y el paso de anonimizar; evaluación con las preguntas 6 y 7 sobre la política. T2 a T5: «Lo que no puede faltar» con los puntos nuevos. Sección 6, estándares: regla de cuenta y de datos.</w:t>
+              <w:t xml:space="preserve">Fechas del T1: 23 y 30 de octubre comercial, 23 y 28 administrativo. T2 comercial: 13 y 20 de noviembre. T1 de los dos perfiles: demostración con el archivo del kit y el paso de anonimizar; evaluación con las preguntas 6 y 7 sobre la política. T2 a T5: «Lo que no puede faltar» con los puntos nuevos. Sección 6, estándares: regla de cuenta y de datos.</w:t>
             </w:r>
           </w:p>
         </w:tc>
@@ -10457,7 +10457,7 @@
                 <w:sz w:val="19"/>
                 <w:szCs w:val="19"/>
               </w:rPr>
-              <w:t xml:space="preserve">La versión ajustada del 15 de octubre reemplaza a la de Drive; la anterior pasa a 09 como superada. En la hoja Jueves de Superpoderes, los retos 5, 10, 17 y 22 con el texto nuevo. En Decisiones y Roles, los retos terminan el 29 de abril y el rol instruccional lo asume la dirección.</w:t>
+              <w:t xml:space="preserve">La versión ajustada del 19 de octubre reemplaza a la de Drive; la anterior pasa a 09 como superada. En la hoja Jueves de Superpoderes, los retos 5, 10, 17 y 22 con el texto nuevo. En Decisiones y Roles, los retos terminan el 29 de abril y el rol instruccional lo asume la dirección.</w:t>
             </w:r>
           </w:p>
         </w:tc>
@@ -10670,7 +10670,7 @@
         <w:sz w:val="16"/>
         <w:szCs w:val="16"/>
       </w:rPr>
-      <w:t xml:space="preserve">Pivot Power · documento de trabajo · 15 de octubre de 2026</w:t>
+      <w:t xml:space="preserve">Pivot Power · documento de trabajo · 19 de octubre de 2026</w:t>
     </w:r>
     <w:r>
       <w:rPr>

</xml_diff>